<commit_message>
Eén database mvc met het nieuwe createscript
Alle tabellen staan nu in één database mvc, van Allergeen tot users.
Het createscript is vervangen: het maakt alleen de zes Jamin-tabellen
opnieuw aan, zodat de tabellen van Laravel blijven staan. De migratie
voert het script daarom ongewijzigd uit en de aparte connectie jamin
is weg. De Database Specificatie Tabel volgt de nieuwe kolomtypes van
Leverancier en Magazijn, en db/ bevat hetzelfde script.
</commit_message>
<xml_diff>
--- a/docs/Database Specificatie Tabel.docx
+++ b/docs/Database Specificatie Tabel.docx
@@ -1807,7 +1807,7 @@
                 <w:sz w:val="19"/>
                 <w:szCs w:val="19"/>
               </w:rPr>
-              <w:t xml:space="preserve">50</w:t>
+              <w:t xml:space="preserve">100</w:t>
             </w:r>
           </w:p>
         </w:tc>
@@ -1889,89 +1889,89 @@
                 <w:sz w:val="19"/>
                 <w:szCs w:val="19"/>
               </w:rPr>
+              <w:t xml:space="preserve">20</w:t>
+            </w:r>
+          </w:p>
+        </w:tc>
+        <w:tc>
+          <w:tcPr>
+            <w:tcW w:type="dxa" w:w="1200"/>
+          </w:tcPr>
+          <w:p>
+            <w:r>
+              <w:rPr>
+                <w:b w:val="false"/>
+                <w:bCs w:val="false"/>
+                <w:sz w:val="19"/>
+                <w:szCs w:val="19"/>
+              </w:rPr>
+              <w:t xml:space="preserve">Nee</w:t>
+            </w:r>
+          </w:p>
+        </w:tc>
+        <w:tc>
+          <w:tcPr>
+            <w:tcW w:type="dxa" w:w="3160"/>
+          </w:tcPr>
+          <w:p>
+            <w:r>
+              <w:rPr>
+                <w:b w:val="false"/>
+                <w:bCs w:val="false"/>
+                <w:sz w:val="19"/>
+                <w:szCs w:val="19"/>
+              </w:rPr>
+              <w:t xml:space="preserve">Leveranciersnummer, bijvoorbeeld L1029384719</w:t>
+            </w:r>
+          </w:p>
+        </w:tc>
+      </w:tr>
+      <w:tr>
+        <w:tc>
+          <w:tcPr>
+            <w:tcW w:type="dxa" w:w="2400"/>
+          </w:tcPr>
+          <w:p>
+            <w:r>
+              <w:rPr>
+                <w:b w:val="false"/>
+                <w:bCs w:val="false"/>
+                <w:sz w:val="19"/>
+                <w:szCs w:val="19"/>
+              </w:rPr>
+              <w:t xml:space="preserve">Mobiel</w:t>
+            </w:r>
+          </w:p>
+        </w:tc>
+        <w:tc>
+          <w:tcPr>
+            <w:tcW w:type="dxa" w:w="1500"/>
+          </w:tcPr>
+          <w:p>
+            <w:r>
+              <w:rPr>
+                <w:b w:val="false"/>
+                <w:bCs w:val="false"/>
+                <w:sz w:val="19"/>
+                <w:szCs w:val="19"/>
+              </w:rPr>
+              <w:t xml:space="preserve">VARCHAR</w:t>
+            </w:r>
+          </w:p>
+        </w:tc>
+        <w:tc>
+          <w:tcPr>
+            <w:tcW w:type="dxa" w:w="1100"/>
+          </w:tcPr>
+          <w:p>
+            <w:r>
+              <w:rPr>
+                <w:b w:val="false"/>
+                <w:bCs w:val="false"/>
+                <w:sz w:val="19"/>
+                <w:szCs w:val="19"/>
+              </w:rPr>
               <w:t xml:space="preserve">15</w:t>
-            </w:r>
-          </w:p>
-        </w:tc>
-        <w:tc>
-          <w:tcPr>
-            <w:tcW w:type="dxa" w:w="1200"/>
-          </w:tcPr>
-          <w:p>
-            <w:r>
-              <w:rPr>
-                <w:b w:val="false"/>
-                <w:bCs w:val="false"/>
-                <w:sz w:val="19"/>
-                <w:szCs w:val="19"/>
-              </w:rPr>
-              <w:t xml:space="preserve">Nee</w:t>
-            </w:r>
-          </w:p>
-        </w:tc>
-        <w:tc>
-          <w:tcPr>
-            <w:tcW w:type="dxa" w:w="3160"/>
-          </w:tcPr>
-          <w:p>
-            <w:r>
-              <w:rPr>
-                <w:b w:val="false"/>
-                <w:bCs w:val="false"/>
-                <w:sz w:val="19"/>
-                <w:szCs w:val="19"/>
-              </w:rPr>
-              <w:t xml:space="preserve">Leveranciersnummer, bijvoorbeeld L1029384719</w:t>
-            </w:r>
-          </w:p>
-        </w:tc>
-      </w:tr>
-      <w:tr>
-        <w:tc>
-          <w:tcPr>
-            <w:tcW w:type="dxa" w:w="2400"/>
-          </w:tcPr>
-          <w:p>
-            <w:r>
-              <w:rPr>
-                <w:b w:val="false"/>
-                <w:bCs w:val="false"/>
-                <w:sz w:val="19"/>
-                <w:szCs w:val="19"/>
-              </w:rPr>
-              <w:t xml:space="preserve">Mobiel</w:t>
-            </w:r>
-          </w:p>
-        </w:tc>
-        <w:tc>
-          <w:tcPr>
-            <w:tcW w:type="dxa" w:w="1500"/>
-          </w:tcPr>
-          <w:p>
-            <w:r>
-              <w:rPr>
-                <w:b w:val="false"/>
-                <w:bCs w:val="false"/>
-                <w:sz w:val="19"/>
-                <w:szCs w:val="19"/>
-              </w:rPr>
-              <w:t xml:space="preserve">VARCHAR</w:t>
-            </w:r>
-          </w:p>
-        </w:tc>
-        <w:tc>
-          <w:tcPr>
-            <w:tcW w:type="dxa" w:w="1100"/>
-          </w:tcPr>
-          <w:p>
-            <w:r>
-              <w:rPr>
-                <w:b w:val="false"/>
-                <w:bCs w:val="false"/>
-                <w:sz w:val="19"/>
-                <w:szCs w:val="19"/>
-              </w:rPr>
-              <w:t xml:space="preserve">12</w:t>
             </w:r>
           </w:p>
         </w:tc>
@@ -2678,7 +2678,7 @@
                 <w:sz w:val="19"/>
                 <w:szCs w:val="19"/>
               </w:rPr>
-              <w:t xml:space="preserve">5,2</w:t>
+              <w:t xml:space="preserve">4,1</w:t>
             </w:r>
           </w:p>
         </w:tc>
@@ -2710,7 +2710,7 @@
                 <w:sz w:val="19"/>
                 <w:szCs w:val="19"/>
               </w:rPr>
-              <w:t xml:space="preserve">Verpakkingseenheid in kilogram, UNSIGNED</w:t>
+              <w:t xml:space="preserve">Verpakkingseenheid in kilogram</w:t>
             </w:r>
           </w:p>
         </w:tc>

</xml_diff>